<commit_message>
round2 consolidation: decision map (H12) + honest revision propagated to FINAL-REPORT
H12 phase map: blind beats random only at clutter=0; supervised beats full only at clutter+~10 labels.
Round-2 conclusion: AE not distinctly best anywhere; doc-18 nonlinear edge did not reproduce; use
regime-matched supervised selection (marginal MI clutter, RF-importance nonlinear); always benchmark vs
random + full. Added overnight addendum to FINAL-REPORT exec summary (supersedes optimistic claims).

Co-Authored-By: Claude Opus 4.8 (1M context) <noreply@anthropic.com>
</commit_message>
<xml_diff>
--- a/docs/spectraforge/FINAL-REPORT.docx
+++ b/docs/spectraforge/FINAL-REPORT.docx
@@ -424,6 +424,255 @@
     <w:p>
       <w:r>
         <w:t>§13.)* The remaining gate is validation on the real Lichens / Collagen cubes.</w:t>
+      </w:r>
+    </w:p>
+    <w:p>
+      <w:pPr>
+        <w:pStyle w:val="IntenseQuote"/>
+      </w:pPr>
+      <w:r>
+        <w:t xml:space="preserve">**⚠️ Overnight addendum (autonomous research rounds 1–2, see </w:t>
+      </w:r>
+      <w:r>
+        <w:rPr>
+          <w:rFonts w:ascii="Consolas" w:hAnsi="Consolas"/>
+          <w:color w:val="B03060"/>
+          <w:sz w:val="19"/>
+        </w:rPr>
+        <w:t>OVERNIGHT-LOG.md</w:t>
+      </w:r>
+      <w:r>
+        <w:t>) — an honest, decisive</w:t>
+      </w:r>
+    </w:p>
+    <w:p>
+      <w:pPr>
+        <w:pStyle w:val="IntenseQuote"/>
+      </w:pPr>
+      <w:r>
+        <w:t>revision.</w:t>
+      </w:r>
+      <w:r>
+        <w:rPr>
+          <w:b/>
+        </w:rPr>
+        <w:t xml:space="preserve"> A two-round autonomous study with significance testing and a </w:t>
+      </w:r>
+      <w:r>
+        <w:t>random baseline** (the</w:t>
+      </w:r>
+    </w:p>
+    <w:p>
+      <w:pPr>
+        <w:pStyle w:val="IntenseQuote"/>
+      </w:pPr>
+      <w:r>
+        <w:t>control this program had been missing) sharply revised the verdict:</w:t>
+      </w:r>
+    </w:p>
+    <w:p>
+      <w:pPr>
+        <w:pStyle w:val="IntenseQuote"/>
+      </w:pPr>
+      <w:r>
+        <w:t xml:space="preserve">1. </w:t>
+      </w:r>
+      <w:r>
+        <w:rPr>
+          <w:b/>
+        </w:rPr>
+        <w:t>Blind selection (AE *and* PCA) does not beat *random* band selection under realistic clutter</w:t>
+      </w:r>
+      <w:r>
+        <w:t xml:space="preserve"> —</w:t>
+      </w:r>
+    </w:p>
+    <w:p>
+      <w:pPr>
+        <w:pStyle w:val="IntenseQuote"/>
+      </w:pPr>
+      <w:r>
+        <w:t>it only beats random on clean/clutter-free data. The cause is the clutter (class-irrelevant</w:t>
+      </w:r>
+    </w:p>
+    <w:p>
+      <w:pPr>
+        <w:pStyle w:val="IntenseQuote"/>
+      </w:pPr>
+      <w:r>
+        <w:t>high-variance structure), not resolution (tested and confirmed).</w:t>
+      </w:r>
+    </w:p>
+    <w:p>
+      <w:pPr>
+        <w:pStyle w:val="IntenseQuote"/>
+      </w:pPr>
+      <w:r>
+        <w:t xml:space="preserve">2. </w:t>
+      </w:r>
+      <w:r>
+        <w:rPr>
+          <w:b/>
+        </w:rPr>
+        <w:t>Blind selection never beats full-data;</w:t>
+      </w:r>
+      <w:r>
+        <w:t xml:space="preserve"> supervised selection beats full only in a narrow corner</w:t>
+      </w:r>
+    </w:p>
+    <w:p>
+      <w:pPr>
+        <w:pStyle w:val="IntenseQuote"/>
+      </w:pPr>
+      <w:r>
+        <w:t xml:space="preserve">(clutter + ~10 labels/class). Band selection is a </w:t>
+      </w:r>
+      <w:r>
+        <w:rPr>
+          <w:b/>
+        </w:rPr>
+        <w:t>compression</w:t>
+      </w:r>
+      <w:r>
+        <w:t xml:space="preserve"> tool, not an accuracy tool.</w:t>
+      </w:r>
+    </w:p>
+    <w:p>
+      <w:pPr>
+        <w:pStyle w:val="IntenseQuote"/>
+      </w:pPr>
+      <w:r>
+        <w:t xml:space="preserve">3. </w:t>
+      </w:r>
+      <w:r>
+        <w:rPr>
+          <w:b/>
+        </w:rPr>
+        <w:t>The AE+perturbation is not distinctly best in any regime</w:t>
+      </w:r>
+      <w:r>
+        <w:t>, and its lone "nonlinear reabsorption</w:t>
+      </w:r>
+    </w:p>
+    <w:p>
+      <w:pPr>
+        <w:pStyle w:val="IntenseQuote"/>
+      </w:pPr>
+      <w:r>
+        <w:t xml:space="preserve">edge over PCA" (doc 18 / §13) </w:t>
+      </w:r>
+      <w:r>
+        <w:rPr>
+          <w:b/>
+        </w:rPr>
+        <w:t>did not reproduce at 3 seeds</w:t>
+      </w:r>
+      <w:r>
+        <w:t xml:space="preserve"> (AE *below* PCA).</w:t>
+      </w:r>
+    </w:p>
+    <w:p>
+      <w:pPr>
+        <w:pStyle w:val="IntenseQuote"/>
+      </w:pPr>
+      <w:r>
+        <w:t xml:space="preserve">4. </w:t>
+      </w:r>
+      <w:r>
+        <w:rPr>
+          <w:b/>
+        </w:rPr>
+        <w:t>Recommendation:</w:t>
+      </w:r>
+      <w:r>
+        <w:t xml:space="preserve"> use </w:t>
+      </w:r>
+      <w:r>
+        <w:rPr>
+          <w:b/>
+        </w:rPr>
+        <w:t>regime-matched *supervised* selection</w:t>
+      </w:r>
+      <w:r>
+        <w:t xml:space="preserve"> — marginal mutual-information for</w:t>
+      </w:r>
+    </w:p>
+    <w:p>
+      <w:pPr>
+        <w:pStyle w:val="IntenseQuote"/>
+      </w:pPr>
+      <w:r>
+        <w:t xml:space="preserve">clutter/linear confounds, </w:t>
+      </w:r>
+      <w:r>
+        <w:rPr>
+          <w:b/>
+        </w:rPr>
+        <w:t>RF-importance for nonlinear</w:t>
+      </w:r>
+      <w:r>
+        <w:t xml:space="preserve"> structure — and always benchmark against</w:t>
+      </w:r>
+    </w:p>
+    <w:p>
+      <w:pPr>
+        <w:pStyle w:val="IntenseQuote"/>
+      </w:pPr>
+      <w:r>
+        <w:rPr>
+          <w:b/>
+        </w:rPr>
+        <w:t>random</w:t>
+      </w:r>
+      <w:r>
+        <w:t xml:space="preserve"> and </w:t>
+      </w:r>
+      <w:r>
+        <w:rPr>
+          <w:b/>
+        </w:rPr>
+        <w:t>full-data</w:t>
+      </w:r>
+      <w:r>
+        <w:t>. The unsupervised AE idea, while sound, is dominated by simpler methods.</w:t>
+      </w:r>
+    </w:p>
+    <w:p>
+      <w:pPr>
+        <w:pStyle w:val="IntenseQuote"/>
+      </w:pPr>
+    </w:p>
+    <w:p>
+      <w:pPr>
+        <w:pStyle w:val="IntenseQuote"/>
+      </w:pPr>
+      <w:r>
+        <w:t>The narrative below documents how the method was debugged and made competitive; the overnight addendum</w:t>
+      </w:r>
+    </w:p>
+    <w:p>
+      <w:pPr>
+        <w:pStyle w:val="IntenseQuote"/>
+      </w:pPr>
+      <w:r>
+        <w:t xml:space="preserve">is the </w:t>
+      </w:r>
+      <w:r>
+        <w:rPr>
+          <w:b/>
+        </w:rPr>
+        <w:t>current, significance-tested bottom line</w:t>
+      </w:r>
+      <w:r>
+        <w:t xml:space="preserve"> and supersedes the more optimistic claims in §§10–13</w:t>
+      </w:r>
+    </w:p>
+    <w:p>
+      <w:pPr>
+        <w:pStyle w:val="IntenseQuote"/>
+      </w:pPr>
+      <w:r>
+        <w:t>where they conflict.</w:t>
       </w:r>
     </w:p>
     <w:p>

</xml_diff>

<commit_message>
round2 CONCLUDED: AE adds no distinctive value over PCA in any role (selection or denoising)
H16b control: clean-data denoising win is LINEAR (PCA-recon(8) 0.888 >= AErec 0.879); AE nonlinearity
adds nothing; denoising helps only on clean. Final two-round verdict written to OVERNIGHT-LOG top +
FINAL-REPORT addendum: use low-rank PCA denoising on clean, regime-matched supervised selection on
cluttered data; AE dominated by simpler methods everywhere. Real-data is the only open gate.

Co-Authored-By: Claude Opus 4.8 (1M context) <noreply@anthropic.com>
</commit_message>
<xml_diff>
--- a/docs/spectraforge/FINAL-REPORT.docx
+++ b/docs/spectraforge/FINAL-REPORT.docx
@@ -582,19 +582,10 @@
         <w:rPr>
           <w:b/>
         </w:rPr>
-        <w:t>Recommendation:</w:t>
-      </w:r>
-      <w:r>
-        <w:t xml:space="preserve"> use </w:t>
-      </w:r>
-      <w:r>
-        <w:rPr>
-          <w:b/>
-        </w:rPr>
-        <w:t>regime-matched *supervised* selection</w:t>
-      </w:r>
-      <w:r>
-        <w:t xml:space="preserve"> — marginal mutual-information for</w:t>
+        <w:t>Even as a *denoiser* the AE adds nothing over PCA.</w:t>
+      </w:r>
+      <w:r>
+        <w:t xml:space="preserve"> Classifying on the AE reconstruction helps</w:t>
       </w:r>
     </w:p>
     <w:p>
@@ -602,16 +593,7 @@
         <w:pStyle w:val="IntenseQuote"/>
       </w:pPr>
       <w:r>
-        <w:t xml:space="preserve">clutter/linear confounds, </w:t>
-      </w:r>
-      <w:r>
-        <w:rPr>
-          <w:b/>
-        </w:rPr>
-        <w:t>RF-importance for nonlinear</w:t>
-      </w:r>
-      <w:r>
-        <w:t xml:space="preserve"> structure — and always benchmark against</w:t>
+        <w:t>+0.13 on *clean* data, but that is *linear* low-rank denoising — **PCA-reconstruction(8) does it as</w:t>
       </w:r>
     </w:p>
     <w:p>
@@ -619,9 +601,103 @@
         <w:pStyle w:val="IntenseQuote"/>
       </w:pPr>
       <w:r>
+        <w:t>well or better**; the AE's nonlinearity adds nothing, and it helps only on clean data.</w:t>
+      </w:r>
+    </w:p>
+    <w:p>
+      <w:pPr>
+        <w:pStyle w:val="IntenseQuote"/>
+      </w:pPr>
+      <w:r>
+        <w:t xml:space="preserve">5. </w:t>
+      </w:r>
+      <w:r>
         <w:rPr>
           <w:b/>
         </w:rPr>
+        <w:t>Recommendation:</w:t>
+      </w:r>
+      <w:r>
+        <w:t xml:space="preserve"> </w:t>
+      </w:r>
+      <w:r>
+        <w:rPr>
+          <w:b/>
+        </w:rPr>
+        <w:t>clean data →</w:t>
+      </w:r>
+      <w:r>
+        <w:t xml:space="preserve"> low-rank PCA denoising + blind selection (or just full data);</w:t>
+      </w:r>
+    </w:p>
+    <w:p>
+      <w:pPr>
+        <w:pStyle w:val="IntenseQuote"/>
+      </w:pPr>
+      <w:r>
+        <w:rPr>
+          <w:b/>
+        </w:rPr>
+        <w:t>cluttered/realistic data →</w:t>
+      </w:r>
+      <w:r>
+        <w:t xml:space="preserve"> regime-matched </w:t>
+      </w:r>
+      <w:r>
+        <w:rPr>
+          <w:b/>
+        </w:rPr>
+        <w:t>*supervised</w:t>
+      </w:r>
+      <w:r>
+        <w:t>* selection (marginal MI for clutter,</w:t>
+      </w:r>
+    </w:p>
+    <w:p>
+      <w:pPr>
+        <w:pStyle w:val="IntenseQuote"/>
+      </w:pPr>
+      <w:r>
+        <w:t xml:space="preserve">RF-importance for nonlinear) — the only thing that beats random. Selection is a </w:t>
+      </w:r>
+      <w:r>
+        <w:rPr>
+          <w:b/>
+        </w:rPr>
+        <w:t>compression</w:t>
+      </w:r>
+      <w:r>
+        <w:t xml:space="preserve"> tool,</w:t>
+      </w:r>
+    </w:p>
+    <w:p>
+      <w:pPr>
+        <w:pStyle w:val="IntenseQuote"/>
+      </w:pPr>
+      <w:r>
+        <w:t xml:space="preserve">not an accuracy tool, and is </w:t>
+      </w:r>
+      <w:r>
+        <w:rPr>
+          <w:b/>
+        </w:rPr>
+        <w:t>unstable</w:t>
+      </w:r>
+      <w:r>
+        <w:t xml:space="preserve"> under clutter (use regions/consensus). Always benchmark</w:t>
+      </w:r>
+    </w:p>
+    <w:p>
+      <w:pPr>
+        <w:pStyle w:val="IntenseQuote"/>
+      </w:pPr>
+      <w:r>
+        <w:t xml:space="preserve">against </w:t>
+      </w:r>
+      <w:r>
+        <w:rPr>
+          <w:b/>
+        </w:rPr>
         <w:t>random</w:t>
       </w:r>
       <w:r>
@@ -634,7 +710,21 @@
         <w:t>full-data</w:t>
       </w:r>
       <w:r>
-        <w:t>. The unsupervised AE idea, while sound, is dominated by simpler methods.</w:t>
+        <w:t>. The unsupervised AE+perturbation idea, while sound and fully</w:t>
+      </w:r>
+    </w:p>
+    <w:p>
+      <w:pPr>
+        <w:pStyle w:val="IntenseQuote"/>
+      </w:pPr>
+      <w:r>
+        <w:t xml:space="preserve">debugged, is </w:t>
+      </w:r>
+      <w:r>
+        <w:rPr>
+          <w:b/>
+        </w:rPr>
+        <w:t>dominated by simpler (PCA / supervised) methods in every role and regime tested.</w:t>
       </w:r>
     </w:p>
     <w:p>

</xml_diff>

<commit_message>
round3 CONCLUDED: per-pixel selection barrier + spatial-CAE vindicated for spatial discrimination
Constructive answer: (1) per-pixel band selection has a fundamental barrier (AE no advantage; ~30 expts);
(2) the convolutional/spatial approach is structurally NECESSARY for spatial-texture discrimination where
per-pixel methods are provably blind (3 seeds, block-CV). Vindicates the original spatial-CAE idea in its
proper domain. FINAL-REPORT addendum + docx updated.

Co-Authored-By: Claude Opus 4.8 (1M context) <noreply@anthropic.com>
</commit_message>
<xml_diff>
--- a/docs/spectraforge/FINAL-REPORT.docx
+++ b/docs/spectraforge/FINAL-REPORT.docx
@@ -725,6 +725,125 @@
           <w:b/>
         </w:rPr>
         <w:t>dominated by simpler (PCA / supervised) methods in every role and regime tested.</w:t>
+      </w:r>
+    </w:p>
+    <w:p>
+      <w:pPr>
+        <w:pStyle w:val="IntenseQuote"/>
+      </w:pPr>
+      <w:r>
+        <w:t xml:space="preserve">6. </w:t>
+      </w:r>
+      <w:r>
+        <w:rPr>
+          <w:b/>
+        </w:rPr>
+        <w:t>Round 3 (mechanism-driven mitigation campaign, ~30 more experiments).</w:t>
+      </w:r>
+      <w:r>
+        <w:t xml:space="preserve"> Attacked every failure at</w:t>
+      </w:r>
+    </w:p>
+    <w:p>
+      <w:pPr>
+        <w:pStyle w:val="IntenseQuote"/>
+      </w:pPr>
+      <w:r>
+        <w:t>its cause (contrastive clutter-invariance, supervised AE, AE-denoising, sparse-signal, spatial). All</w:t>
+      </w:r>
+    </w:p>
+    <w:p>
+      <w:pPr>
+        <w:pStyle w:val="IntenseQuote"/>
+      </w:pPr>
+      <w:r>
+        <w:t>per-pixel mitigations hit the same wall: *selection ≠ classification*, and a discriminative band is</w:t>
+      </w:r>
+    </w:p>
+    <w:p>
+      <w:pPr>
+        <w:pStyle w:val="IntenseQuote"/>
+      </w:pPr>
+      <w:r>
+        <w:t>either bright (simple methods find it) or dim (unextractable) — so the AE's *selection* mechanism is</w:t>
+      </w:r>
+    </w:p>
+    <w:p>
+      <w:pPr>
+        <w:pStyle w:val="IntenseQuote"/>
+      </w:pPr>
+      <w:r>
+        <w:t xml:space="preserve">never both necessary and sufficient. </w:t>
+      </w:r>
+      <w:r>
+        <w:rPr>
+          <w:b/>
+        </w:rPr>
+        <w:t>The one genuine, structurally-necessary win:</w:t>
+      </w:r>
+      <w:r>
+        <w:t xml:space="preserve"> when class is</w:t>
+      </w:r>
+    </w:p>
+    <w:p>
+      <w:pPr>
+        <w:pStyle w:val="IntenseQuote"/>
+      </w:pPr>
+      <w:r>
+        <w:t xml:space="preserve">carried by </w:t>
+      </w:r>
+      <w:r>
+        <w:rPr>
+          <w:b/>
+        </w:rPr>
+        <w:t>spatial texture</w:t>
+      </w:r>
+      <w:r>
+        <w:t xml:space="preserve"> (identical per-pixel marginals), **per-pixel band selection is provably</w:t>
+      </w:r>
+    </w:p>
+    <w:p>
+      <w:pPr>
+        <w:pStyle w:val="IntenseQuote"/>
+      </w:pPr>
+      <w:r>
+        <w:t>blind</w:t>
+      </w:r>
+      <w:r>
+        <w:rPr>
+          <w:b/>
+        </w:rPr>
+        <w:t xml:space="preserve"> (the worst, below random, honest spatial-block CV) and only a </w:t>
+      </w:r>
+      <w:r>
+        <w:t>spatial/convolutional**</w:t>
+      </w:r>
+    </w:p>
+    <w:p>
+      <w:pPr>
+        <w:pStyle w:val="IntenseQuote"/>
+      </w:pPr>
+      <w:r>
+        <w:t>approach works — **vindicating the original spatial-CAE idea for *spatial* discrimination, not</w:t>
+      </w:r>
+    </w:p>
+    <w:p>
+      <w:pPr>
+        <w:pStyle w:val="IntenseQuote"/>
+      </w:pPr>
+      <w:r>
+        <w:t xml:space="preserve">per-pixel spectral band selection.** Detail in </w:t>
+      </w:r>
+      <w:r>
+        <w:rPr>
+          <w:rFonts w:ascii="Consolas" w:hAnsi="Consolas"/>
+          <w:color w:val="B03060"/>
+          <w:sz w:val="19"/>
+        </w:rPr>
+        <w:t>OVERNIGHT-LOG.md</w:t>
+      </w:r>
+      <w:r>
+        <w:t xml:space="preserve"> (Round-3 conclusion).</w:t>
       </w:r>
     </w:p>
     <w:p>

</xml_diff>